<commit_message>
docs: título do orientador e orientador como autor correspondente na versão 11
</commit_message>
<xml_diff>
--- a/Docs/Artigo_SIMPOS_2026_v11_2026-10-20.docx
+++ b/Docs/Artigo_SIMPOS_2026_v11_2026-10-20.docx
@@ -28,7 +28,7 @@
           <w:b/>
           <w:sz w:val="28"/>
         </w:rPr>
-        <w:t>INFLUÊNCIA DAS DIFERENÇAS ESPERADAS NA PROGÊNIE NA PRECIFICAÇÃO DO SÊMEN BOVINO</w:t>
+        <w:t>PRECIFICAÇÃO HEDÔNICA DA DOSE DE SÊMEN DE TOUROS NELORE: INTEGRAÇÃO ENTRE GENÉTICA, SELOS COMERCIAIS E LINHAGENS</w:t>
       </w:r>
     </w:p>
     <w:p>
@@ -86,7 +86,7 @@
           <w:rFonts w:eastAsia="Times New Roman" w:cs="Times New Roman"/>
           <w:b/>
         </w:rPr>
-        <w:t>*; Sandro Henrique Antunes RIBEIRO</w:t>
+        <w:t>; Sandro Henrique Antunes RIBEIRO</w:t>
       </w:r>
       <w:r>
         <w:rPr>
@@ -95,6 +95,13 @@
           <w:vertAlign w:val="superscript"/>
         </w:rPr>
         <w:t>(2)</w:t>
+      </w:r>
+      <w:r>
+        <w:rPr>
+          <w:rFonts w:eastAsia="Times New Roman" w:cs="Times New Roman"/>
+          <w:b/>
+        </w:rPr>
+        <w:t>*</w:t>
       </w:r>
     </w:p>
     <w:p>

</xml_diff>

<commit_message>
feat: Figura 1 como gráfico de halteres
- 04: a Figura 1 mostra o preço médio dos touros Comerciais e Super Elite em
  cada DEP, no eixo do próprio preço, em vez do ágio com IC de 95%; o azul
  continua marcando p < 0,05 no teste de Welch; a tabela ganhou os preços
  médios das duas classes (fig_agio_deps_ic95.png substituída por
  fig_agio_deps.png)
- v11: nova Figura 1, legenda e frases dos Resultados ajustadas; nota de que
  na STAY e na PAC o ágio vem do preço baixo dos touros Comerciais
</commit_message>
<xml_diff>
--- a/Docs/Artigo_SIMPOS_2026_v11_2026-10-20.docx
+++ b/Docs/Artigo_SIMPOS_2026_v11_2026-10-20.docx
@@ -2960,7 +2960,7 @@
           <w:rFonts w:eastAsia="Times New Roman" w:cs="Times New Roman"/>
           <w:lang w:val="pt-BR"/>
         </w:rPr>
-        <w:t>A Figura 1 apresenta o ágio entre as classes extremas para as 18 DEPs. O maior foi o do CAR (+R$ 6,84 por dose; +22,2%), seguido do da STAY (+R$ 6,48; +22,4%). CAR, STAY, FRAME, MP210 e PAC tiveram intervalo de confiança de 95% inteiramente acima de zero, mas nenhuma delas se manteria significativa com a correção de Bonferroni para as 18 comparações (p &lt; 0,0028). Para as demais, inclusive o MGTe (+R$ 3,77) e a AOL (+R$ 3,62), a diferença não se distinguiu da variação casual, e as características de peso tiveram os menores ágios, de +R$ 2,33 (P210), +R$ 1,38 (P365) e +R$ 1,69 (P450).</w:t>
+        <w:t>A Figura 1 compara, nas 18 DEPs, o preço médio da dose dos touros das classes extremas. O maior ágio foi o do CAR (+R$ 6,84 por dose; +22,2%), seguido do da STAY (+R$ 6,48; +22,4%). CAR, STAY, FRAME, MP210 e PAC tiveram diferença significativa no teste de Welch (p &lt; 0,05), mas nenhuma delas se manteria significativa com a correção de Bonferroni para as 18 comparações (p &lt; 0,0028). Na STAY e na PAC, o ágio veio sobretudo do preço mais baixo dos touros Comerciais (R$ 28,85 e R$ 29,18, abaixo da média geral de R$ 32,28); no CAR, foram os touros Super Elite que se destacaram, com a maior média da figura. Para as demais, inclusive o MGTe (+R$ 3,77) e a AOL (+R$ 3,62), a diferença não se distinguiu da variação casual, e as características de peso tiveram os menores ágios, de +R$ 2,33 (P210), +R$ 1,38 (P365) e +R$ 1,69 (P450).</w:t>
       </w:r>
     </w:p>
     <w:p>
@@ -3068,7 +3068,7 @@
         <w:rPr>
           <w:rFonts w:eastAsia="Times New Roman" w:cs="Times New Roman"/>
         </w:rPr>
-        <w:t>Figura 1. Ágio no preço da dose de sêmen (R$) para as 18 DEPs da ANCP: diferença entre o preço médio dos touros Super Elite (TOP ≤ 3%) e o dos touros Comerciais (TOP &gt; 20%) em cada característica. O círculo marca o ágio observado e a linha horizontal, o intervalo de confiança de 95% (teste de Welch); à direita do zero, a dose dos touros Super Elite é mais cara. Em azul e com círculo cheio, as DEPs cuja linha fica inteira à direita do zero, isto é, com ágio significativo (p &lt; 0,05); em cinza, aquelas em que a diferença pode ser atribuída ao acaso. Na coluna da direita, o ágio e o número de touros Super Elite / Comerciais.</w:t>
+        <w:t>Figura 1. Preço médio da dose de sêmen (R$) dos touros Comerciais (TOP &gt; 20%, círculo vazio) e Super Elite (TOP ≤ 3%, círculo cheio) em cada uma das 18 DEPs da ANCP; o comprimento da barra é o ágio dos touros Super Elite. Em azul, as DEPs com diferença significativa no teste de Welch (p &lt; 0,05); em cinza, aquelas em que a diferença pode ser atribuída ao acaso. A linha tracejada marca a média geral (R$ 32,28). Na coluna da direita, o ágio e o número de touros Super Elite / Comerciais.</w:t>
       </w:r>
     </w:p>
     <w:p>

</xml_diff>